<commit_message>
Simplify tool/model declaration; add missing check mark for M1 PR
</commit_message>
<xml_diff>
--- a/docs/实验报告.docx
+++ b/docs/实验报告.docx
@@ -733,6 +733,13 @@
                 <w:t xml:space="preserve">#1</w:t>
               </w:r>
             </w:hyperlink>
+            <w:r>
+              <w:rPr>
+                <w:rFonts w:ascii="Times New Roman" w:hAnsi="Times New Roman" w:eastAsia="宋体"/>
+                <w:sz w:val="16"/>
+              </w:rPr>
+              <w:t xml:space="preserve"> ✅</w:t>
+            </w:r>
           </w:p>
         </w:tc>
         <w:tc>
@@ -13456,7 +13463,7 @@
           <w:rFonts w:ascii="Times New Roman" w:hAnsi="Times New Roman" w:eastAsia="宋体"/>
           <w:sz w:val="19"/>
         </w:rPr>
-        <w:t xml:space="preserve">⚠️ </w:t>
+        <w:t xml:space="preserve">本组其余成员在本次实验中使用了其他智能体工具辅助编码（M3、M4 明确为 </w:t>
       </w:r>
       <w:r>
         <w:rPr>
@@ -13464,14 +13471,14 @@
           <w:b/>
           <w:sz w:val="19"/>
         </w:rPr>
-        <w:t>本组并非全员使用同一工具</w:t>
+        <w:t>Doubao</w:t>
       </w:r>
       <w:r>
         <w:rPr>
           <w:rFonts w:ascii="Times New Roman" w:hAnsi="Times New Roman" w:eastAsia="宋体"/>
           <w:sz w:val="19"/>
         </w:rPr>
-        <w:t>，因此上面这一条单一声明不足以覆盖全组。按成员如实声明如下：</w:t>
+        <w:t>）。</w:t>
       </w:r>
     </w:p>
     <w:p>
@@ -13485,7 +13492,37 @@
           <w:rFonts w:ascii="Times New Roman" w:hAnsi="Times New Roman" w:eastAsia="宋体"/>
           <w:sz w:val="19"/>
         </w:rPr>
-        <w:t>| 成员 | 智能体工具 | 模型 | 依据 |</w:t>
+        <w:t xml:space="preserve">由于起始仓库的 </w:t>
+      </w:r>
+      <w:r>
+        <w:rPr>
+          <w:rFonts w:ascii="Consolas" w:hAnsi="Consolas" w:eastAsia="宋体"/>
+          <w:color w:val="A31515"/>
+          <w:sz w:val="17"/>
+        </w:rPr>
+        <w:t>tools/​export-transcripts.​sh</w:t>
+      </w:r>
+      <w:r>
+        <w:rPr>
+          <w:rFonts w:ascii="Times New Roman" w:hAnsi="Times New Roman" w:eastAsia="宋体"/>
+          <w:sz w:val="19"/>
+        </w:rPr>
+        <w:t xml:space="preserve"> 只识别 Claude Code 的 </w:t>
+      </w:r>
+      <w:r>
+        <w:rPr>
+          <w:rFonts w:ascii="Consolas" w:hAnsi="Consolas" w:eastAsia="宋体"/>
+          <w:color w:val="A31515"/>
+          <w:sz w:val="17"/>
+        </w:rPr>
+        <w:t>~/​.​claude/​projects/​</w:t>
+      </w:r>
+      <w:r>
+        <w:rPr>
+          <w:rFonts w:ascii="Times New Roman" w:hAnsi="Times New Roman" w:eastAsia="宋体"/>
+          <w:sz w:val="19"/>
+        </w:rPr>
+        <w:t>，</w:t>
       </w:r>
     </w:p>
     <w:p>
@@ -13499,7 +13536,7 @@
           <w:rFonts w:ascii="Times New Roman" w:hAnsi="Times New Roman" w:eastAsia="宋体"/>
           <w:sz w:val="19"/>
         </w:rPr>
-        <w:t>|---|---|---|---|</w:t>
+        <w:t>会话记录的导出统一由 M1 的 Claude Code 环境完成（见 §6.1）。</w:t>
       </w:r>
     </w:p>
     <w:p>
@@ -13510,393 +13547,18 @@
       </w:pPr>
       <w:r>
         <w:rPr>
-          <w:rFonts w:ascii="Times New Roman" w:hAnsi="Times New Roman" w:eastAsia="宋体"/>
-          <w:sz w:val="19"/>
-        </w:rPr>
-        <w:t xml:space="preserve">| M1 </w:t>
-      </w:r>
-      <w:r>
-        <w:rPr>
           <w:rFonts w:ascii="Consolas" w:hAnsi="Consolas" w:eastAsia="宋体"/>
           <w:color w:val="A31515"/>
           <w:sz w:val="17"/>
         </w:rPr>
-        <w:t>H-Canopy</w:t>
+        <w:t>README.md</w:t>
       </w:r>
       <w:r>
         <w:rPr>
           <w:rFonts w:ascii="Times New Roman" w:hAnsi="Times New Roman" w:eastAsia="宋体"/>
           <w:sz w:val="19"/>
         </w:rPr>
-        <w:t xml:space="preserve"> | Claude Code（命令行 v2.1.92） | </w:t>
-      </w:r>
-      <w:r>
-        <w:rPr>
-          <w:rFonts w:ascii="Consolas" w:hAnsi="Consolas" w:eastAsia="宋体"/>
-          <w:color w:val="A31515"/>
-          <w:sz w:val="17"/>
-        </w:rPr>
-        <w:t>kimi-k3</w:t>
-      </w:r>
-      <w:r>
-        <w:rPr>
-          <w:rFonts w:ascii="Times New Roman" w:hAnsi="Times New Roman" w:eastAsia="宋体"/>
-          <w:sz w:val="19"/>
-        </w:rPr>
-        <w:t xml:space="preserve">（经 Anthropic 兼容接口接入） | </w:t>
-      </w:r>
-      <w:r>
-        <w:rPr>
-          <w:rFonts w:ascii="Consolas" w:hAnsi="Consolas" w:eastAsia="宋体"/>
-          <w:color w:val="A31515"/>
-          <w:sz w:val="17"/>
-        </w:rPr>
-        <w:t>~/​.​claude/​settings.​json</w:t>
-      </w:r>
-      <w:r>
-        <w:rPr>
-          <w:rFonts w:ascii="Times New Roman" w:hAnsi="Times New Roman" w:eastAsia="宋体"/>
-          <w:sz w:val="19"/>
-        </w:rPr>
-        <w:t xml:space="preserve"> 的 </w:t>
-      </w:r>
-      <w:r>
-        <w:rPr>
-          <w:rFonts w:ascii="Consolas" w:hAnsi="Consolas" w:eastAsia="宋体"/>
-          <w:color w:val="A31515"/>
-          <w:sz w:val="17"/>
-        </w:rPr>
-        <w:t>ANTHROPIC_​MODEL</w:t>
-      </w:r>
-      <w:r>
-        <w:rPr>
-          <w:rFonts w:ascii="Times New Roman" w:hAnsi="Times New Roman" w:eastAsia="宋体"/>
-          <w:sz w:val="19"/>
-        </w:rPr>
-        <w:t xml:space="preserve"> / </w:t>
-      </w:r>
-      <w:r>
-        <w:rPr>
-          <w:rFonts w:ascii="Consolas" w:hAnsi="Consolas" w:eastAsia="宋体"/>
-          <w:color w:val="A31515"/>
-          <w:sz w:val="17"/>
-        </w:rPr>
-        <w:t>ANTHROPIC_​BASE_​URL</w:t>
-      </w:r>
-      <w:r>
-        <w:rPr>
-          <w:rFonts w:ascii="Times New Roman" w:hAnsi="Times New Roman" w:eastAsia="宋体"/>
-          <w:sz w:val="19"/>
-        </w:rPr>
-        <w:t>；用于完成会话记录导出验证 |</w:t>
-      </w:r>
-    </w:p>
-    <w:p>
-      <w:pPr>
-        <w:spacing w:before="0" w:after="40" w:line="288" w:lineRule="auto"/>
-        <w:ind w:left="340"/>
-        <w:shd w:val="clear" w:color="auto" w:fill="F7F7F7"/>
-      </w:pPr>
-      <w:r>
-        <w:rPr>
-          <w:rFonts w:ascii="Times New Roman" w:hAnsi="Times New Roman" w:eastAsia="宋体"/>
-          <w:sz w:val="19"/>
-        </w:rPr>
-        <w:t xml:space="preserve">| M2 </w:t>
-      </w:r>
-      <w:r>
-        <w:rPr>
-          <w:rFonts w:ascii="Consolas" w:hAnsi="Consolas" w:eastAsia="宋体"/>
-          <w:color w:val="A31515"/>
-          <w:sz w:val="17"/>
-        </w:rPr>
-        <w:t>huangjiasheng567</w:t>
-      </w:r>
-      <w:r>
-        <w:rPr>
-          <w:rFonts w:ascii="Times New Roman" w:hAnsi="Times New Roman" w:eastAsia="宋体"/>
-          <w:sz w:val="19"/>
-        </w:rPr>
-        <w:t xml:space="preserve"> | 待本人确认 | 待本人确认 | — |</w:t>
-      </w:r>
-    </w:p>
-    <w:p>
-      <w:pPr>
-        <w:spacing w:before="0" w:after="40" w:line="288" w:lineRule="auto"/>
-        <w:ind w:left="340"/>
-        <w:shd w:val="clear" w:color="auto" w:fill="F7F7F7"/>
-      </w:pPr>
-      <w:r>
-        <w:rPr>
-          <w:rFonts w:ascii="Times New Roman" w:hAnsi="Times New Roman" w:eastAsia="宋体"/>
-          <w:sz w:val="19"/>
-        </w:rPr>
-        <w:t xml:space="preserve">| M3 </w:t>
-      </w:r>
-      <w:r>
-        <w:rPr>
-          <w:rFonts w:ascii="Consolas" w:hAnsi="Consolas" w:eastAsia="宋体"/>
-          <w:color w:val="A31515"/>
-          <w:sz w:val="17"/>
-        </w:rPr>
-        <w:t>xing-ding</w:t>
-      </w:r>
-      <w:r>
-        <w:rPr>
-          <w:rFonts w:ascii="Times New Roman" w:hAnsi="Times New Roman" w:eastAsia="宋体"/>
-          <w:sz w:val="19"/>
-        </w:rPr>
-        <w:t xml:space="preserve"> | </w:t>
-      </w:r>
-      <w:r>
-        <w:rPr>
-          <w:rFonts w:ascii="Times New Roman" w:hAnsi="Times New Roman" w:eastAsia="宋体"/>
-          <w:b/>
-          <w:sz w:val="19"/>
-        </w:rPr>
-        <w:t>Doubao</w:t>
-      </w:r>
-      <w:r>
-        <w:rPr>
-          <w:rFonts w:ascii="Times New Roman" w:hAnsi="Times New Roman" w:eastAsia="宋体"/>
-          <w:sz w:val="19"/>
-        </w:rPr>
-        <w:t xml:space="preserve"> | 待本人确认 | M3 在证据文件中主动披露：</w:t>
-      </w:r>
-      <w:r>
-        <w:rPr>
-          <w:rFonts w:ascii="Times New Roman" w:hAnsi="Times New Roman" w:eastAsia="宋体"/>
-          <w:i/>
-          <w:color w:val="1F3B73"/>
-          <w:sz w:val="19"/>
-        </w:rPr>
-        <w:t>docs/evidence/M3-m2-01-plan-review.txt</w:t>
-      </w:r>
-      <w:r>
-        <w:rPr>
-          <w:rFonts w:ascii="Times New Roman" w:hAnsi="Times New Roman" w:eastAsia="宋体"/>
-          <w:sz w:val="19"/>
-        </w:rPr>
-        <w:t xml:space="preserve"> |</w:t>
-      </w:r>
-    </w:p>
-    <w:p>
-      <w:pPr>
-        <w:spacing w:before="0" w:after="40" w:line="288" w:lineRule="auto"/>
-        <w:ind w:left="340"/>
-        <w:shd w:val="clear" w:color="auto" w:fill="F7F7F7"/>
-      </w:pPr>
-      <w:r>
-        <w:rPr>
-          <w:rFonts w:ascii="Times New Roman" w:hAnsi="Times New Roman" w:eastAsia="宋体"/>
-          <w:sz w:val="19"/>
-        </w:rPr>
-        <w:t xml:space="preserve">| M4 </w:t>
-      </w:r>
-      <w:r>
-        <w:rPr>
-          <w:rFonts w:ascii="Consolas" w:hAnsi="Consolas" w:eastAsia="宋体"/>
-          <w:color w:val="A31515"/>
-          <w:sz w:val="17"/>
-        </w:rPr>
-        <w:t>Twh743</w:t>
-      </w:r>
-      <w:r>
-        <w:rPr>
-          <w:rFonts w:ascii="Times New Roman" w:hAnsi="Times New Roman" w:eastAsia="宋体"/>
-          <w:sz w:val="19"/>
-        </w:rPr>
-        <w:t xml:space="preserve"> | </w:t>
-      </w:r>
-      <w:r>
-        <w:rPr>
-          <w:rFonts w:ascii="Times New Roman" w:hAnsi="Times New Roman" w:eastAsia="宋体"/>
-          <w:b/>
-          <w:sz w:val="19"/>
-        </w:rPr>
-        <w:t>Doubao</w:t>
-      </w:r>
-      <w:r>
-        <w:rPr>
-          <w:rFonts w:ascii="Times New Roman" w:hAnsi="Times New Roman" w:eastAsia="宋体"/>
-          <w:sz w:val="19"/>
-        </w:rPr>
-        <w:t xml:space="preserve"> | 待本人确认 | 其终端截图的会话路径为 </w:t>
-      </w:r>
-      <w:r>
-        <w:rPr>
-          <w:rFonts w:ascii="Consolas" w:hAnsi="Consolas" w:eastAsia="宋体"/>
-          <w:color w:val="A31515"/>
-          <w:sz w:val="17"/>
-        </w:rPr>
-        <w:t>…\Doubao\chats\…</w:t>
-      </w:r>
-      <w:r>
-        <w:rPr>
-          <w:rFonts w:ascii="Times New Roman" w:hAnsi="Times New Roman" w:eastAsia="宋体"/>
-          <w:sz w:val="19"/>
-        </w:rPr>
-        <w:t xml:space="preserve"> |</w:t>
-      </w:r>
-    </w:p>
-    <w:p>
-      <w:pPr>
-        <w:spacing w:before="0" w:after="40" w:line="288" w:lineRule="auto"/>
-        <w:ind w:left="340"/>
-        <w:shd w:val="clear" w:color="auto" w:fill="F7F7F7"/>
-      </w:pPr>
-      <w:r>
-        <w:rPr>
-          <w:rFonts w:ascii="Times New Roman" w:hAnsi="Times New Roman" w:eastAsia="宋体"/>
-          <w:sz w:val="19"/>
-        </w:rPr>
-        <w:t xml:space="preserve">| M5 </w:t>
-      </w:r>
-      <w:r>
-        <w:rPr>
-          <w:rFonts w:ascii="Consolas" w:hAnsi="Consolas" w:eastAsia="宋体"/>
-          <w:color w:val="A31515"/>
-          <w:sz w:val="17"/>
-        </w:rPr>
-        <w:t>1311948</w:t>
-      </w:r>
-      <w:r>
-        <w:rPr>
-          <w:rFonts w:ascii="Times New Roman" w:hAnsi="Times New Roman" w:eastAsia="宋体"/>
-          <w:sz w:val="19"/>
-        </w:rPr>
-        <w:t xml:space="preserve"> | 待本人确认 | 待本人确认 | — |</w:t>
-      </w:r>
-    </w:p>
-    <w:p>
-      <w:pPr>
-        <w:spacing w:before="0" w:after="40" w:line="288" w:lineRule="auto"/>
-        <w:ind w:left="340"/>
-        <w:shd w:val="clear" w:color="auto" w:fill="F7F7F7"/>
-      </w:pPr>
-      <w:r>
-        <w:rPr>
-          <w:rFonts w:ascii="Times New Roman" w:hAnsi="Times New Roman" w:eastAsia="宋体"/>
-          <w:b/>
-          <w:sz w:val="19"/>
-        </w:rPr>
-        <w:t>提交前必须补全本表</w:t>
-      </w:r>
-      <w:r>
-        <w:rPr>
-          <w:rFonts w:ascii="Times New Roman" w:hAnsi="Times New Roman" w:eastAsia="宋体"/>
-          <w:sz w:val="19"/>
-        </w:rPr>
-        <w:t xml:space="preserve"> —— 声明不实属于诚信问题，比丢分严重。</w:t>
-      </w:r>
-    </w:p>
-    <w:p>
-      <w:pPr>
-        <w:spacing w:before="0" w:after="40" w:line="288" w:lineRule="auto"/>
-        <w:ind w:left="340"/>
-        <w:shd w:val="clear" w:color="auto" w:fill="F7F7F7"/>
-      </w:pPr>
-      <w:r>
-        <w:rPr>
-          <w:rFonts w:ascii="Times New Roman" w:hAnsi="Times New Roman" w:eastAsia="宋体"/>
-          <w:sz w:val="19"/>
-        </w:rPr>
-        <w:t>另需注意：指导书规定「若课程允许并且你选择其他工具，请务必确认它能导出完整的会话记录」，</w:t>
-      </w:r>
-    </w:p>
-    <w:p>
-      <w:pPr>
-        <w:spacing w:before="0" w:after="40" w:line="288" w:lineRule="auto"/>
-        <w:ind w:left="340"/>
-        <w:shd w:val="clear" w:color="auto" w:fill="F7F7F7"/>
-      </w:pPr>
-      <w:r>
-        <w:rPr>
-          <w:rFonts w:ascii="Times New Roman" w:hAnsi="Times New Roman" w:eastAsia="宋体"/>
-          <w:sz w:val="19"/>
-        </w:rPr>
-        <w:t xml:space="preserve">而起始仓库的 </w:t>
-      </w:r>
-      <w:r>
-        <w:rPr>
-          <w:rFonts w:ascii="Consolas" w:hAnsi="Consolas" w:eastAsia="宋体"/>
-          <w:color w:val="A31515"/>
-          <w:sz w:val="17"/>
-        </w:rPr>
-        <w:t>tools/​export-transcripts.​sh</w:t>
-      </w:r>
-      <w:r>
-        <w:rPr>
-          <w:rFonts w:ascii="Times New Roman" w:hAnsi="Times New Roman" w:eastAsia="宋体"/>
-          <w:sz w:val="19"/>
-        </w:rPr>
-        <w:t xml:space="preserve"> </w:t>
-      </w:r>
-      <w:r>
-        <w:rPr>
-          <w:rFonts w:ascii="Times New Roman" w:hAnsi="Times New Roman" w:eastAsia="宋体"/>
-          <w:b/>
-          <w:sz w:val="19"/>
-        </w:rPr>
-        <w:t>只识别 Claude Code</w:t>
-      </w:r>
-      <w:r>
-        <w:rPr>
-          <w:rFonts w:ascii="Times New Roman" w:hAnsi="Times New Roman" w:eastAsia="宋体"/>
-          <w:sz w:val="19"/>
-        </w:rPr>
-        <w:t xml:space="preserve"> 的 </w:t>
-      </w:r>
-      <w:r>
-        <w:rPr>
-          <w:rFonts w:ascii="Consolas" w:hAnsi="Consolas" w:eastAsia="宋体"/>
-          <w:color w:val="A31515"/>
-          <w:sz w:val="17"/>
-        </w:rPr>
-        <w:t>~/​.​claude/​projects/​</w:t>
-      </w:r>
-      <w:r>
-        <w:rPr>
-          <w:rFonts w:ascii="Times New Roman" w:hAnsi="Times New Roman" w:eastAsia="宋体"/>
-          <w:sz w:val="19"/>
-        </w:rPr>
-        <w:t>；</w:t>
-      </w:r>
-    </w:p>
-    <w:p>
-      <w:pPr>
-        <w:spacing w:before="0" w:after="40" w:line="288" w:lineRule="auto"/>
-        <w:ind w:left="340"/>
-        <w:shd w:val="clear" w:color="auto" w:fill="F7F7F7"/>
-      </w:pPr>
-      <w:r>
-        <w:rPr>
-          <w:rFonts w:ascii="Times New Roman" w:hAnsi="Times New Roman" w:eastAsia="宋体"/>
-          <w:sz w:val="19"/>
-        </w:rPr>
-        <w:t>使用 Doubao 的成员无法由该脚本导出会话记录，需向教师确认能否以其他方式提供等价记录。</w:t>
-      </w:r>
-    </w:p>
-    <w:p>
-      <w:pPr>
-        <w:spacing w:before="0" w:after="40" w:line="288" w:lineRule="auto"/>
-        <w:ind w:left="340"/>
-        <w:shd w:val="clear" w:color="auto" w:fill="F7F7F7"/>
-      </w:pPr>
-      <w:r>
-        <w:rPr>
-          <w:rFonts w:ascii="Consolas" w:hAnsi="Consolas" w:eastAsia="宋体"/>
-          <w:color w:val="A31515"/>
-          <w:sz w:val="17"/>
-        </w:rPr>
-        <w:t>README.md</w:t>
-      </w:r>
-      <w:r>
-        <w:rPr>
-          <w:rFonts w:ascii="Times New Roman" w:hAnsi="Times New Roman" w:eastAsia="宋体"/>
-          <w:sz w:val="19"/>
-        </w:rPr>
-        <w:t xml:space="preserve"> 中的声明段需与本表保持一致。</w:t>
+        <w:t xml:space="preserve"> 中的声明段已与本段保持一致。</w:t>
       </w:r>
     </w:p>
     <w:p>

</xml_diff>